<commit_message>
Add architecture diagrams and change README
</commit_message>
<xml_diff>
--- a/docs/LitSurvey_and_ResearchGaps.docx
+++ b/docs/LitSurvey_and_ResearchGaps.docx
@@ -27,24 +27,19 @@
       <w:pPr>
         <w:ind w:left="-900" w:right="-900"/>
         <w:jc w:val="both"/>
+      </w:pPr>
+    </w:p>
+    <w:p>
+      <w:pPr>
+        <w:ind w:left="-900" w:right="-900"/>
+        <w:jc w:val="both"/>
+      </w:pPr>
+      <w:r>
         <w:rPr>
           <w:b/>
           <w:bCs/>
         </w:rPr>
-      </w:pPr>
-      <w:r>
-        <w:rPr>
-          <w:b/>
-          <w:bCs/>
-        </w:rPr>
-        <w:t xml:space="preserve">A] </w:t>
-      </w:r>
-      <w:r>
-        <w:rPr>
-          <w:b/>
-          <w:bCs/>
-        </w:rPr>
-        <w:t>Pranav</w:t>
+        <w:t>A] Pranav</w:t>
       </w:r>
     </w:p>
     <w:p>
@@ -66,18 +61,21 @@
         <w:jc w:val="both"/>
       </w:pPr>
       <w:r>
-        <w:t>Applies AI to database-layer energy use (workload distribution, predictive maintenance, storage tiering), citing up to ~40% cooling-energy reduction. Notes that training the AI models themselves is energy-intensive, partly offsetting savings elsewhere. The gap I'd emphasize: there's no universal standard for how sustainability/energy usage should even be measured and reported, which makes it hard to compare green-database claims like this one against others on equal footing.</w:t>
-      </w:r>
-    </w:p>
-    <w:p>
-      <w:pPr>
-        <w:ind w:left="-900" w:right="-900"/>
-        <w:jc w:val="both"/>
+        <w:t>Uses AI in energy consumption at database level (workload management, prediction for maintenance, data storage tiering), with estimates of 40% savings in cooling energy. Points out that training AI models requires energy consumption, partially balancing savings in other areas. This is the discrepancy I would bring forward: There is no universal way of measuring energy consumption of such a system and reporting it.</w:t>
+      </w:r>
+    </w:p>
+    <w:p>
+      <w:pPr>
+        <w:ind w:left="-900" w:right="-900"/>
+        <w:jc w:val="both"/>
+      </w:pPr>
+      <w:r>
         <w:rPr>
           <w:b/>
           <w:bCs/>
         </w:rPr>
-      </w:pPr>
+        <w:t> </w:t>
+      </w:r>
     </w:p>
     <w:p>
       <w:pPr>
@@ -89,55 +87,26 @@
           <w:b/>
           <w:bCs/>
         </w:rPr>
-        <w:t>Paper 2: Machine Learning in Energy and Thermal-Aware Resource Management — Taxonomy (</w:t>
-      </w:r>
-      <w:proofErr w:type="spellStart"/>
-      <w:r>
-        <w:rPr>
-          <w:b/>
-          <w:bCs/>
-        </w:rPr>
-        <w:t>Ilager</w:t>
-      </w:r>
-      <w:proofErr w:type="spellEnd"/>
-      <w:r>
-        <w:rPr>
-          <w:b/>
-          <w:bCs/>
-        </w:rPr>
-        <w:t xml:space="preserve"> &amp; </w:t>
-      </w:r>
-      <w:proofErr w:type="spellStart"/>
-      <w:r>
-        <w:rPr>
-          <w:b/>
-          <w:bCs/>
-        </w:rPr>
-        <w:t>Buyya</w:t>
-      </w:r>
-      <w:proofErr w:type="spellEnd"/>
-      <w:r>
-        <w:rPr>
-          <w:b/>
-          <w:bCs/>
-        </w:rPr>
-        <w:t>)</w:t>
-      </w:r>
-    </w:p>
-    <w:p>
-      <w:pPr>
-        <w:ind w:left="-900" w:right="-900"/>
-        <w:jc w:val="both"/>
-      </w:pPr>
-      <w:r>
-        <w:t>Taxonomizes ML approaches for joint computing-and-cooling management, arguing this coupling is usually ignored since IT and facilities teams manage these separately. Models trained on one data center often don't transfer to another, and there's no standard tooling for embedding ML into existing platforms. My read: the real gap isn't a missing algorithm, it's an organizational/tooling one — computing and cooling are optimized as two separate problems when they're physically the same system.</w:t>
-      </w:r>
-    </w:p>
-    <w:p>
-      <w:pPr>
-        <w:ind w:left="-900" w:right="-900"/>
-        <w:jc w:val="both"/>
-      </w:pPr>
+        <w:t>Paper 2: Machine Learning in Energy and Thermal-Aware Resource Management — Taxonomy (Ilager &amp; Buyya)</w:t>
+      </w:r>
+    </w:p>
+    <w:p>
+      <w:pPr>
+        <w:ind w:left="-900" w:right="-900"/>
+        <w:jc w:val="both"/>
+      </w:pPr>
+      <w:r>
+        <w:t>Categorizes the types of ML algorithms used in joint computing and cooling optimization and suggests that the reason this integration hasn’t occurred before is because IT and facilities have always managed these processes separately. The models trained at one data center will not transfer to another, and there is no established platform for integrating ML. My interpretation: It’s not really about the lack of the algorithm but rather the organization and tooling problem.</w:t>
+      </w:r>
+    </w:p>
+    <w:p>
+      <w:pPr>
+        <w:ind w:left="-900" w:right="-900"/>
+        <w:jc w:val="both"/>
+      </w:pPr>
+      <w:r>
+        <w:t> </w:t>
+      </w:r>
     </w:p>
     <w:p>
       <w:pPr>
@@ -158,14 +127,17 @@
         <w:jc w:val="both"/>
       </w:pPr>
       <w:r>
-        <w:t>Proposes WA3C, a multi-agent DRL scheduler with a composite reward balancing latency, energy, throughput, and fairness. Outperforms both heuristics and standard DRL baselines, but is costly to train and hard to integrate into existing orchestration systems. The gap I'd point to: most DRL-based scheduling treats every job identically, with no explicit fairness mechanism — meaning aggressive high-priority workloads can silently starve smaller ones, a risk directly relevant to a shared university environment with many competing departments/users.</w:t>
-      </w:r>
-    </w:p>
-    <w:p>
-      <w:pPr>
-        <w:ind w:left="-900" w:right="-900"/>
-        <w:jc w:val="both"/>
-      </w:pPr>
+        <w:t>Introduces the WA3C architecture that uses a multi-agent DRL scheduling scheme with a reward function which takes into account latency, energy, throughput, and fairness. Outperforms heuristic solutions and baseline DRL approaches, but it is costly to learn and difficult to embed in current orchestration platforms. What I see here is the problem of treating all jobs the same way and not using any fair allocation approach in DRL-based scheduling schemes. This may result in starvation of low-priority tasks by higher ones.</w:t>
+      </w:r>
+    </w:p>
+    <w:p>
+      <w:pPr>
+        <w:ind w:left="-900" w:right="-900"/>
+        <w:jc w:val="both"/>
+      </w:pPr>
+      <w:r>
+        <w:t> </w:t>
+      </w:r>
     </w:p>
     <w:p>
       <w:pPr>
@@ -186,24 +158,17 @@
         <w:jc w:val="both"/>
       </w:pPr>
       <w:r>
-        <w:t xml:space="preserve">Frames allocation as a decentralized multi-agent MDP with an attention layer, cutting energy ~10.5% versus RL baselines with strong fairness scores. Validated only in a simulated Python environment, not against real-world workload traces. In my understanding, the underlying gap is that most RL allocators struggle to deliver scalability, real-time responsiveness, and fairness </w:t>
-      </w:r>
-      <w:r>
-        <w:rPr>
-          <w:i/>
-          <w:iCs/>
-        </w:rPr>
-        <w:t>*simultaneously*</w:t>
-      </w:r>
-      <w:r>
-        <w:t xml:space="preserve"> — this paper improves on fairness and responsiveness, but real-world scalability remains unproven.</w:t>
-      </w:r>
-    </w:p>
-    <w:p>
-      <w:pPr>
-        <w:ind w:left="-900" w:right="-900"/>
-        <w:jc w:val="both"/>
-      </w:pPr>
+        <w:t>Allocates frames using a decentralized multi-agent Markov Decision Process with an attention layer, saving power up to 10.5% compared to RL-based algorithms with high fairness metrics. Only verified in simulated Python settings; not validated against real workloads. As far as I can see, the problem is that most RL-based allocators fail to offer scalability, real-time performance, and fairness all at once.</w:t>
+      </w:r>
+    </w:p>
+    <w:p>
+      <w:pPr>
+        <w:ind w:left="-900" w:right="-900"/>
+        <w:jc w:val="both"/>
+      </w:pPr>
+      <w:r>
+        <w:t> </w:t>
+      </w:r>
     </w:p>
     <w:p>
       <w:pPr>
@@ -215,59 +180,132 @@
           <w:b/>
           <w:bCs/>
         </w:rPr>
-        <w:t xml:space="preserve">Paper </w:t>
-      </w:r>
+        <w:t>Paper 5: HunterPlus — AI-Based Energy-Efficient Task Scheduling for Cloud-Fog Environments (Iftikhar et al.)</w:t>
+      </w:r>
+    </w:p>
+    <w:p>
+      <w:pPr>
+        <w:ind w:left="-900" w:right="-900"/>
+        <w:jc w:val="both"/>
+      </w:pPr>
+      <w:r>
+        <w:lastRenderedPageBreak/>
+        <w:t>Improve the surrogate model for QoS prediction from unidirectional GGCN to Bi-GRU+CNN, resulting in a minimum 17% reduction in cloud-fog energy consumption. Requires actual computation costs and additional hardware which are beyond the capabilities of many small IoT/fog nodes. The previous approach to cloud-fog scheduling used forecasting without taking into account future context, which was the advantage that this newer approach has; however, the hardware requirement of this improved technique presents a hurdle to its application precisely where it is most needed (edge devices).</w:t>
+      </w:r>
+    </w:p>
+    <w:p>
+      <w:pPr>
+        <w:ind w:left="-900" w:right="-900"/>
+        <w:jc w:val="both"/>
+      </w:pPr>
+      <w:r>
+        <w:t>----------------------------------------------------------------------------------------------------------------------------------------</w:t>
+      </w:r>
+    </w:p>
+    <w:p>
+      <w:pPr>
+        <w:ind w:left="-900" w:right="-900"/>
+        <w:jc w:val="both"/>
+      </w:pPr>
       <w:r>
         <w:rPr>
           <w:b/>
           <w:bCs/>
         </w:rPr>
-        <w:t>5</w:t>
-      </w:r>
+        <w:t>B] Agrani</w:t>
+      </w:r>
+    </w:p>
+    <w:p>
+      <w:pPr>
+        <w:ind w:left="-900" w:right="-900"/>
+        <w:jc w:val="both"/>
+      </w:pPr>
       <w:r>
         <w:rPr>
           <w:b/>
           <w:bCs/>
         </w:rPr>
-        <w:t xml:space="preserve">: </w:t>
-      </w:r>
-      <w:proofErr w:type="spellStart"/>
+        <w:t>Paper 1: AI Supported Energy Management in Smart Campuses (Manassra &amp; Işık)</w:t>
+      </w:r>
+    </w:p>
+    <w:p>
+      <w:pPr>
+        <w:ind w:left="-900" w:right="-900"/>
+        <w:jc w:val="both"/>
+      </w:pPr>
+      <w:r>
+        <w:t>Combines multiple ML models (MLP, CNN, RNN, RL) for the optimization of lighting, heating, ventilation and air conditioning, and renewables through IoT sensors in real-time, simulating approximately 59% energy savings. It is simulation-based and requires clean sensor data. My opinion about the gap is that previous research into campus energy has dealt with individual subsystems exclusively. What this paper does differently is consider the entire campus as an integrated system – something most smart campus literature does not.</w:t>
+      </w:r>
+    </w:p>
+    <w:p>
+      <w:pPr>
+        <w:ind w:left="-900" w:right="-900"/>
+        <w:jc w:val="both"/>
+      </w:pPr>
+      <w:r>
+        <w:t> </w:t>
+      </w:r>
+    </w:p>
+    <w:p>
+      <w:pPr>
+        <w:ind w:left="-900" w:right="-900"/>
+        <w:jc w:val="both"/>
+      </w:pPr>
       <w:r>
         <w:rPr>
           <w:b/>
           <w:bCs/>
         </w:rPr>
-        <w:t>HunterPlus</w:t>
-      </w:r>
-      <w:proofErr w:type="spellEnd"/>
+        <w:t>Paper 2: A Green Cloud-Based Framework for Energy-Efficient Task Scheduling Using Carbon Intensity Data (Beena et al.)</w:t>
+      </w:r>
+    </w:p>
+    <w:p>
+      <w:pPr>
+        <w:ind w:left="-900" w:right="-900"/>
+        <w:jc w:val="both"/>
+      </w:pPr>
+      <w:r>
+        <w:t>Scheduling based on real-time carbon-intensity information per region, natively built using AWS &amp; Kubernetes. Very efficient, but works purely based on operations emissions (does not consider manufacturing emissions) and fully relies on the correctness of external carbon-data APIs. I would phrase the problem as: virtually no frameworks actually use any live data for their calculations of carbon-intensity (most use static figures), and virtually none take into account the differences in carbon intensity per geographic region, which is important when the data center of a university is not restricted to one region.</w:t>
+      </w:r>
+    </w:p>
+    <w:p>
+      <w:pPr>
+        <w:ind w:left="-900" w:right="-900"/>
+        <w:jc w:val="both"/>
+      </w:pPr>
+      <w:r>
+        <w:t> </w:t>
+      </w:r>
+    </w:p>
+    <w:p>
+      <w:pPr>
+        <w:ind w:left="-900" w:right="-900"/>
+        <w:jc w:val="both"/>
+      </w:pPr>
       <w:r>
         <w:rPr>
           <w:b/>
           <w:bCs/>
         </w:rPr>
-        <w:t xml:space="preserve"> — AI-Based Energy-Efficient Task Scheduling for Cloud-Fog Environments (Iftikhar et al.)</w:t>
-      </w:r>
-    </w:p>
-    <w:p>
-      <w:pPr>
-        <w:ind w:left="-900" w:right="-900"/>
-        <w:jc w:val="both"/>
-      </w:pPr>
-      <w:r>
-        <w:lastRenderedPageBreak/>
-        <w:t>Upgrades a QoS-prediction surrogate model from single-direction GGCN to Bi-GRU+CNN, cutting cloud-fog energy use by at least 17%. Adds real computational overhead and needs more hardware than many small IoT/fog devices actually have. Earlier cloud-fog scheduling relied on forecasting with only historical context, missing the forward-looking signal that bidirectional models add — but that improvement currently comes at a hardware cost that limits deployment exactly where fog computing is supposed to help most (constrained edge devices).</w:t>
-      </w:r>
-    </w:p>
-    <w:p>
-      <w:pPr>
-        <w:ind w:left="-900" w:right="-900"/>
-        <w:jc w:val="both"/>
-      </w:pPr>
-      <w:r>
-        <w:t>------------------------------------------------------------------------------------------------------------------</w:t>
-      </w:r>
-      <w:r>
-        <w:t>----------------------</w:t>
+        <w:t>Paper 3: AI for Energy-Efficient Cloud Networking (Mohammed et al.)</w:t>
+      </w:r>
+    </w:p>
+    <w:p>
+      <w:pPr>
+        <w:ind w:left="-900" w:right="-900"/>
+        <w:jc w:val="both"/>
+      </w:pPr>
+      <w:r>
+        <w:t>Evaluates AI hypervisors and the predictive analytics for predicting energy consumption, indicating a reduction of about 25 percent in five years and 85 percent accuracy of prediction in the industry. Being a review article, it does not present any new approach, and notes that the existing AI-based models cannot yet be scaled up to dynamic situations. My assessment of the gap: there is abundant literature showing the ability of AI in saving energy but relatively few studies of real-time energy-awareness.</w:t>
+      </w:r>
+    </w:p>
+    <w:p>
+      <w:pPr>
+        <w:ind w:left="-900" w:right="-900"/>
+        <w:jc w:val="both"/>
+      </w:pPr>
+      <w:r>
+        <w:t> </w:t>
       </w:r>
     </w:p>
     <w:p>
@@ -280,254 +318,58 @@
           <w:b/>
           <w:bCs/>
         </w:rPr>
-        <w:t xml:space="preserve">B] </w:t>
-      </w:r>
+        <w:t>Paper 4: CFWS — DRL-Based Framework for Energy Cost and Carbon Footprint Optimization (Zhao, Zhou &amp; Li)</w:t>
+      </w:r>
+    </w:p>
+    <w:p>
+      <w:pPr>
+        <w:ind w:left="-900" w:right="-900"/>
+        <w:jc w:val="both"/>
+      </w:pPr>
+      <w:r>
+        <w:lastRenderedPageBreak/>
+        <w:t>Uses workload shift based on DRL in order to optimize the tradeoff between cost and carbon footprint directly, reducing the usage of brown energy by 5.7-13.2% and VM migration by 87%. Tested only through simulations, also treating the carbon footprint of wind energy generation as constant. Gap that would be mentioned is that simply optimizing cost does not necessarily minimize the carbon footprint, due to the fact that inexpensive power may be sourced from dirty places.</w:t>
+      </w:r>
+    </w:p>
+    <w:p>
+      <w:pPr>
+        <w:ind w:left="-900" w:right="-900"/>
+        <w:jc w:val="both"/>
+      </w:pPr>
+      <w:r>
+        <w:t> </w:t>
+      </w:r>
+    </w:p>
+    <w:p>
+      <w:pPr>
+        <w:ind w:left="-900" w:right="-900"/>
+        <w:jc w:val="both"/>
+      </w:pPr>
       <w:r>
         <w:rPr>
           <w:b/>
           <w:bCs/>
         </w:rPr>
-        <w:t>Agrani</w:t>
-      </w:r>
-    </w:p>
-    <w:p>
-      <w:pPr>
-        <w:ind w:left="-900" w:right="-900"/>
-        <w:jc w:val="both"/>
-      </w:pPr>
-      <w:r>
+        <w:t>Paper 5: Integrating Advanced Technologies for Sustainable Smart Campus Development — Survey (Haggag et al.)</w:t>
+      </w:r>
+    </w:p>
+    <w:p>
+      <w:pPr>
+        <w:ind w:left="-900" w:right="-900"/>
+        <w:jc w:val="both"/>
+      </w:pPr>
+      <w:r>
+        <w:t>Discusses IoT technology, artificial intelligence, digital twins, and other technologies within the context of smart campuses and identifies HVAC cost savings of 40-70% in examined research. Points out that high cost and lack of standardization have been consistent limitations throughout the literature on the topic. My perception is that the primary gap in this area is the way in which these campus technologies have always been examined and implemented in isolation, not as an interconnected system.</w:t>
+      </w:r>
+    </w:p>
+    <w:p>
+      <w:pPr>
+        <w:ind w:left="-900" w:right="-900"/>
+        <w:jc w:val="both"/>
         <w:rPr>
           <w:b/>
           <w:bCs/>
         </w:rPr>
-        <w:t xml:space="preserve">Paper </w:t>
-      </w:r>
-      <w:r>
-        <w:rPr>
-          <w:b/>
-          <w:bCs/>
-        </w:rPr>
-        <w:t xml:space="preserve">1: </w:t>
-      </w:r>
-      <w:r>
-        <w:rPr>
-          <w:b/>
-          <w:bCs/>
-        </w:rPr>
-        <w:t>AI Supported Energy Management in Smart Campuses (</w:t>
-      </w:r>
-      <w:proofErr w:type="spellStart"/>
-      <w:r>
-        <w:rPr>
-          <w:b/>
-          <w:bCs/>
-        </w:rPr>
-        <w:t>Manassra</w:t>
-      </w:r>
-      <w:proofErr w:type="spellEnd"/>
-      <w:r>
-        <w:rPr>
-          <w:b/>
-          <w:bCs/>
-        </w:rPr>
-        <w:t xml:space="preserve"> &amp; Işık)</w:t>
-      </w:r>
-    </w:p>
-    <w:p>
-      <w:pPr>
-        <w:ind w:left="-900" w:right="-900"/>
-        <w:jc w:val="both"/>
-      </w:pPr>
-      <w:r>
-        <w:t>Integrates multiple ML architectures (MLP, CNN, RNN, RL) to jointly optimize lighting, HVAC, and renewables using real-time IoT data, simulating ~59% energy reduction. It's simulation-only and depends heavily on clean sensor data. The gap, in my understanding, is that prior campus energy work almost always tackles one subsystem at a time — this paper's real contribution is treating the campus as one coordinated system, which is precisely the angle most existing smart-campus literature is missing.</w:t>
-      </w:r>
-    </w:p>
-    <w:p>
-      <w:pPr>
-        <w:ind w:left="-900" w:right="-900"/>
-        <w:jc w:val="both"/>
-      </w:pPr>
-    </w:p>
-    <w:p>
-      <w:pPr>
-        <w:ind w:left="-900" w:right="-900"/>
-        <w:jc w:val="both"/>
-      </w:pPr>
-      <w:r>
-        <w:rPr>
-          <w:b/>
-          <w:bCs/>
-        </w:rPr>
-        <w:t xml:space="preserve">Paper </w:t>
-      </w:r>
-      <w:r>
-        <w:rPr>
-          <w:b/>
-          <w:bCs/>
-        </w:rPr>
-        <w:t>2</w:t>
-      </w:r>
-      <w:r>
-        <w:rPr>
-          <w:b/>
-          <w:bCs/>
-        </w:rPr>
-        <w:t>: A Green Cloud-Based Framework for Energy-Efficient Task Scheduling Using Carbon Intensity Data (Beena et al.)</w:t>
-      </w:r>
-    </w:p>
-    <w:p>
-      <w:pPr>
-        <w:ind w:left="-900" w:right="-900"/>
-        <w:jc w:val="both"/>
-      </w:pPr>
-      <w:r>
-        <w:t>Schedules tasks based on real-time regional carbon intensity, built cloud-natively on AWS/Kubernetes. Strong efficiency at low compute overhead, but only accounts for operational emissions (not embodied/manufacturing emissions) and depends entirely on external carbon-data APIs staying accurate. I'd frame the gap as: very few green-cloud frameworks actually plug in live carbon data rather than static assumptions, and almost none account for how carbon intensity varies by geographic region — which matters if a university's data center could shift load across multiple regions.</w:t>
-      </w:r>
-    </w:p>
-    <w:p>
-      <w:pPr>
-        <w:ind w:left="-900" w:right="-900"/>
-        <w:jc w:val="both"/>
-      </w:pPr>
-    </w:p>
-    <w:p>
-      <w:pPr>
-        <w:ind w:left="-900" w:right="-900"/>
-        <w:jc w:val="both"/>
-      </w:pPr>
-      <w:r>
-        <w:rPr>
-          <w:b/>
-          <w:bCs/>
-        </w:rPr>
-        <w:t xml:space="preserve">Paper </w:t>
-      </w:r>
-      <w:r>
-        <w:rPr>
-          <w:b/>
-          <w:bCs/>
-        </w:rPr>
-        <w:t>3</w:t>
-      </w:r>
-      <w:r>
-        <w:rPr>
-          <w:b/>
-          <w:bCs/>
-        </w:rPr>
-        <w:t>: AI for Energy-Efficient Cloud Networking (Mohammed et al.)</w:t>
-      </w:r>
-    </w:p>
-    <w:p>
-      <w:pPr>
-        <w:ind w:left="-900" w:right="-900"/>
-        <w:jc w:val="both"/>
-      </w:pPr>
-      <w:r>
-        <w:t xml:space="preserve">Reviews AI-driven hypervisors and predictive analytics for power forecasting, citing ~25% five-year power savings and ~85% forecast accuracy industry-wide. As a review, it doesn't propose a new technique, and flags that current AI models still aren't reliably scalable to genuinely dynamic conditions. My take on the gap: the field has plenty of evidence that AI </w:t>
-      </w:r>
-      <w:r>
-        <w:rPr>
-          <w:i/>
-          <w:iCs/>
-        </w:rPr>
-        <w:t>*can*</w:t>
-      </w:r>
-      <w:r>
-        <w:t xml:space="preserve"> save power, but comparatively little work on making that power-awareness operate in true real time rather than on historical-pattern forecasts.</w:t>
-      </w:r>
-    </w:p>
-    <w:p>
-      <w:pPr>
-        <w:ind w:left="-900" w:right="-900"/>
-        <w:jc w:val="both"/>
-      </w:pPr>
-    </w:p>
-    <w:p>
-      <w:pPr>
-        <w:ind w:left="-900" w:right="-900"/>
-        <w:jc w:val="both"/>
-      </w:pPr>
-      <w:r>
-        <w:rPr>
-          <w:b/>
-          <w:bCs/>
-        </w:rPr>
-        <w:t xml:space="preserve">Paper </w:t>
-      </w:r>
-      <w:r>
-        <w:rPr>
-          <w:b/>
-          <w:bCs/>
-        </w:rPr>
-        <w:t>4</w:t>
-      </w:r>
-      <w:r>
-        <w:rPr>
-          <w:b/>
-          <w:bCs/>
-        </w:rPr>
-        <w:t>: CFWS — DRL-Based Framework for Energy Cost and Carbon Footprint Optimization (Zhao, Zhou &amp; Li)</w:t>
-      </w:r>
-    </w:p>
-    <w:p>
-      <w:pPr>
-        <w:ind w:left="-900" w:right="-900"/>
-        <w:jc w:val="both"/>
-      </w:pPr>
-      <w:r>
-        <w:t xml:space="preserve">Uses DRL-driven workload shifting to balance cost against carbon footprint directly, cutting brown-energy use 5.7-13.2% and VM migrations by up to 87%. Only tested in simulation, and simplifies wind-energy carbon </w:t>
-      </w:r>
-      <w:r>
-        <w:lastRenderedPageBreak/>
-        <w:t>intensity as constant. The gap I'd highlight: minimizing cost alone doesn't guarantee low carbon footprint, since cheap electricity can still come from dirty sources — a distinction most prior consolidation-focused papers overlook entirely by treating cost and carbon as the same target.</w:t>
-      </w:r>
-    </w:p>
-    <w:p>
-      <w:pPr>
-        <w:ind w:left="-900" w:right="-900"/>
-        <w:jc w:val="both"/>
-      </w:pPr>
-    </w:p>
-    <w:p>
-      <w:pPr>
-        <w:ind w:left="-900" w:right="-900"/>
-        <w:jc w:val="both"/>
-      </w:pPr>
-      <w:r>
-        <w:rPr>
-          <w:b/>
-          <w:bCs/>
-        </w:rPr>
-        <w:t xml:space="preserve">Paper </w:t>
-      </w:r>
-      <w:r>
-        <w:rPr>
-          <w:b/>
-          <w:bCs/>
-        </w:rPr>
-        <w:t>5</w:t>
-      </w:r>
-      <w:r>
-        <w:rPr>
-          <w:b/>
-          <w:bCs/>
-        </w:rPr>
-        <w:t>: Integrating Advanced Technologies for Sustainable Smart Campus Development — Survey (Haggag et al.)</w:t>
-      </w:r>
-    </w:p>
-    <w:p>
-      <w:pPr>
-        <w:ind w:left="-900" w:right="-900"/>
-        <w:jc w:val="both"/>
-      </w:pPr>
-      <w:r>
-        <w:t>Surveys IoT, AI/ML, digital twins, and other tech across smart campuses, reporting 40-70% HVAC savings in reviewed studies. Notes high upfront cost and lack of standardization as recurring limitations across the field. In my understanding, the central gap is that campus technologies are almost always studied and deployed in isolation rather than as one integrated system — which is the exact opening our own project's "university-specific, integrated" framing is built to address.</w:t>
-      </w:r>
-    </w:p>
-    <w:p>
-      <w:pPr>
-        <w:ind w:left="-900" w:right="-900"/>
-        <w:jc w:val="both"/>
       </w:pPr>
     </w:p>
     <w:p>
@@ -549,19 +391,16 @@
         <w:jc w:val="both"/>
       </w:pPr>
       <w:r>
-        <w:t>Surveys power-supply architectures (centralized/distributed UPS, green-energy designs) and formal optimization methods (Lyapunov, MDP/DRL, MILP) for cost- and carbon-aware power management, building detailed loss models per supply component. It deliberately excludes HPC/Edge computing, and its safety models for over-subscribing power rely on static probabilities that don't account for how long or severe a power spike actually is. In my understanding, the real gap is that most sustainability research targets IT workload scheduling or cooling, leaving the power-supply chain itself comparatively unexamined from a cost-optimization angle — despite data centers routinely over-provisioning for peak demand and leaving significant power capacity unused.</w:t>
-      </w:r>
-    </w:p>
-    <w:p>
-      <w:pPr>
-        <w:ind w:left="-900" w:right="-900"/>
-        <w:jc w:val="both"/>
-      </w:pPr>
-      <w:r>
-        <w:t>------------------------------------------------------------------------------------------------------------------</w:t>
-      </w:r>
-      <w:r>
-        <w:t>----------------------</w:t>
+        <w:t>Examines architectures for power-supply configurations (centralized/distributed UPS, green energy-based architectures) and optimization methodologies (Lyapunov, MDP/DRL, MILP) for power management that is cost- and carbon-aware by developing loss models for each supply. However, this paper deliberately does not cover HPC/Edge computing, and safety models developed here for power oversubscription use static probability without considering the duration and intensity of power spikes. As far as I understand, the actual gap lies in the fact that most studies in sustainability have focused on IT workload scheduling or cooling and have ignored the power-supply chain as such while optimizing for cost, even though overprovisioning in data centers is commonplace.</w:t>
+      </w:r>
+    </w:p>
+    <w:p>
+      <w:pPr>
+        <w:ind w:left="-900" w:right="-900"/>
+        <w:jc w:val="both"/>
+      </w:pPr>
+      <w:r>
+        <w:t>----------------------------------------------------------------------------------------------------------------------------------------</w:t>
       </w:r>
     </w:p>
     <w:p>
@@ -574,14 +413,7 @@
           <w:b/>
           <w:bCs/>
         </w:rPr>
-        <w:t>C]</w:t>
-      </w:r>
-      <w:r>
-        <w:rPr>
-          <w:b/>
-          <w:bCs/>
-        </w:rPr>
-        <w:t xml:space="preserve"> Prakul </w:t>
+        <w:t>C] Prakul</w:t>
       </w:r>
     </w:p>
     <w:p>
@@ -603,14 +435,17 @@
         <w:jc w:val="both"/>
       </w:pPr>
       <w:r>
-        <w:t>Existing cloud allocation relied on static rules or classical forecasting (ARIMA/Prophet). This paper combines LSTM demand forecasting with a DQN scheduler, reporting ~32.5% utilization gains and ~43.3% faster response times. However, its baselines were weak and the comparison systems unnamed, limiting how much of the improvement is genuinely attributable to the new method. The real gap isn't just reactive scheduling — it's the absence of any framework that treats efficiency, cost, and service quality as one combined objective rather than three separate tuning problems.</w:t>
-      </w:r>
-    </w:p>
-    <w:p>
-      <w:pPr>
-        <w:ind w:left="-900" w:right="-900"/>
-        <w:jc w:val="both"/>
-      </w:pPr>
+        <w:t>Static rules and classical methods (ARIMA/Prophet) were employed for the cloud allocation problem in existing literature. In this work, we propose to use LSTM demand forecast with DQN scheduler and achieve about 32.5% better cloud utilization rates and about 43.3% faster responses. Nevertheless, the baseline was not good, and the comparison system was not described, so it remains unknown how much of this performance can be really attributed to our new algorithm. The core issue here lies in the absence of an algorithm that considers these three aspects as a single entity.</w:t>
+      </w:r>
+    </w:p>
+    <w:p>
+      <w:pPr>
+        <w:ind w:left="-900" w:right="-900"/>
+        <w:jc w:val="both"/>
+      </w:pPr>
+      <w:r>
+        <w:t> </w:t>
+      </w:r>
     </w:p>
     <w:p>
       <w:pPr>
@@ -622,6 +457,7 @@
           <w:b/>
           <w:bCs/>
         </w:rPr>
+        <w:lastRenderedPageBreak/>
         <w:t>Paper 2: A Survey of Energy-Efficient Strategies for Federated Learning in Mobile Edge Computing (Yan et al.)</w:t>
       </w:r>
     </w:p>
@@ -631,15 +467,17 @@
         <w:jc w:val="both"/>
       </w:pPr>
       <w:r>
-        <w:lastRenderedPageBreak/>
-        <w:t>This survey organizes energy-saving FL strategies into model compression, resource allocation, and client selection. Its strength is being the first consolidated review of energy strategies specifically for resource-limited FL devices. Its weakness is that most reviewed methods assume static, interference-free conditions that don't hold in real deployments. The gap: FL research has focused on making individual techniques work, but almost none have been stress-tested across genuinely varied real-world conditions rather than controlled lab settings.</w:t>
-      </w:r>
-    </w:p>
-    <w:p>
-      <w:pPr>
-        <w:ind w:left="-900" w:right="-900"/>
-        <w:jc w:val="both"/>
-      </w:pPr>
+        <w:t>This survey categorizes energy-efficient FL methods under model compression, resource allocation, and client selection. The advantage of this survey lies in the fact that it is the first ever attempt to consolidate reviews of energy-efficient approaches for resource-constrained FL devices. The disadvantage lies in the assumption of static and interference-free environment by most of the surveyed methods that is not the case during deployment. The gap: while FL research has centered around making each technique viable, few have put them through realistic stress tests.</w:t>
+      </w:r>
+    </w:p>
+    <w:p>
+      <w:pPr>
+        <w:ind w:left="-900" w:right="-900"/>
+        <w:jc w:val="both"/>
+      </w:pPr>
+      <w:r>
+        <w:t> </w:t>
+      </w:r>
     </w:p>
     <w:p>
       <w:pPr>
@@ -651,63 +489,26 @@
           <w:b/>
           <w:bCs/>
         </w:rPr>
-        <w:t>Paper 3: Optimizing Energy Efficiency in Cloud Data Centers — RL-Based VM Placement (</w:t>
-      </w:r>
-      <w:proofErr w:type="spellStart"/>
-      <w:r>
-        <w:rPr>
-          <w:b/>
-          <w:bCs/>
-        </w:rPr>
-        <w:t>Amahrouch</w:t>
-      </w:r>
-      <w:proofErr w:type="spellEnd"/>
-      <w:r>
-        <w:rPr>
-          <w:b/>
-          <w:bCs/>
-        </w:rPr>
-        <w:t xml:space="preserve">, Saadi &amp; El </w:t>
-      </w:r>
-      <w:proofErr w:type="spellStart"/>
-      <w:r>
-        <w:rPr>
-          <w:b/>
-          <w:bCs/>
-        </w:rPr>
-        <w:t>Kafhali</w:t>
-      </w:r>
-      <w:proofErr w:type="spellEnd"/>
-      <w:r>
-        <w:rPr>
-          <w:b/>
-          <w:bCs/>
-        </w:rPr>
-        <w:t>)</w:t>
-      </w:r>
-    </w:p>
-    <w:p>
-      <w:pPr>
-        <w:ind w:left="-900" w:right="-900"/>
-        <w:jc w:val="both"/>
-      </w:pPr>
-      <w:r>
-        <w:t xml:space="preserve">Proposes RLVMP (Q-learning + Firefly optimization + RF/SOM classifier), cutting energy up to ~18.7% over GA baselines with fewer live migrations. It's validated only in </w:t>
-      </w:r>
-      <w:proofErr w:type="spellStart"/>
-      <w:r>
-        <w:t>CloudSim</w:t>
-      </w:r>
-      <w:proofErr w:type="spellEnd"/>
-      <w:r>
-        <w:t xml:space="preserve"> on Azure traces, not live infrastructure, and overload detection relies almost entirely on CPU usage. Most VM-consolidation work optimizes raw resource numbers without considering whether a workload is latency-sensitive — a blind spot that matters for systems running both background batch jobs and latency-sensitive user-facing services simultaneously.</w:t>
-      </w:r>
-    </w:p>
-    <w:p>
-      <w:pPr>
-        <w:ind w:left="-900" w:right="-900"/>
-        <w:jc w:val="both"/>
-      </w:pPr>
+        <w:t>Paper 3: Optimizing Energy Efficiency in Cloud Data Centers — RL-Based VM Placement (Amahrouch, Saadi &amp; El Kafhali)</w:t>
+      </w:r>
+    </w:p>
+    <w:p>
+      <w:pPr>
+        <w:ind w:left="-900" w:right="-900"/>
+        <w:jc w:val="both"/>
+      </w:pPr>
+      <w:r>
+        <w:t>RLVMP (Q-learning + Firefly + RF/SOM classifier) that reduces energy consumption by about 18.7% compared to GA baseline methods, but uses lesser live migrations. The method is tested in the CloudSim simulation environment using the Azure data set and does not test in live environments; also, overload is based mostly on CPU utilization. Most research on VM consolidation focuses on optimizing resources alone and not on whether a system has latency-sensitive tasks alongside other batch jobs.</w:t>
+      </w:r>
+    </w:p>
+    <w:p>
+      <w:pPr>
+        <w:ind w:left="-900" w:right="-900"/>
+        <w:jc w:val="both"/>
+      </w:pPr>
+      <w:r>
+        <w:t> </w:t>
+      </w:r>
     </w:p>
     <w:p>
       <w:pPr>
@@ -728,14 +529,17 @@
         <w:jc w:val="both"/>
       </w:pPr>
       <w:r>
-        <w:t>Uses FL to allocate workload across servers, lowering power draw while preserving data privacy (only gradients are shared, not raw data). Converges quickly (~10 rounds) but is exposed to synchronization complexity and security risks like model poisoning. Most existing green-computing research targets hardware or cooling improvements, while workload-placement-driven power optimization — which this paper tackles — is comparatively under-explored, despite being a lower-cost lever than physical infrastructure changes.</w:t>
-      </w:r>
-    </w:p>
-    <w:p>
-      <w:pPr>
-        <w:ind w:left="-900" w:right="-900"/>
-        <w:jc w:val="both"/>
-      </w:pPr>
+        <w:t>Makes use of FL to distribute the work among the servers to reduce energy consumption without compromising on data privacy since only the gradients get shared, and not the actual data. It converges rapidly (about 10 rounds), but it becomes vulnerable to synchronization problems and attacks such as model poisoning. The current studies that exist on green computing focus on hardware or cooling techniques, whereas the technique used in this paper is relatively neglected.</w:t>
+      </w:r>
+    </w:p>
+    <w:p>
+      <w:pPr>
+        <w:ind w:left="-900" w:right="-900"/>
+        <w:jc w:val="both"/>
+      </w:pPr>
+      <w:r>
+        <w:t> </w:t>
+      </w:r>
     </w:p>
     <w:p>
       <w:pPr>
@@ -747,49 +551,17 @@
           <w:b/>
           <w:bCs/>
         </w:rPr>
-        <w:t>Paper 5: Machine Learning-Based Cloud Resource Allocation Algorithms — Comparative Review (</w:t>
-      </w:r>
-      <w:proofErr w:type="spellStart"/>
-      <w:r>
-        <w:rPr>
-          <w:b/>
-          <w:bCs/>
-        </w:rPr>
-        <w:t>Bodra</w:t>
-      </w:r>
-      <w:proofErr w:type="spellEnd"/>
-      <w:r>
-        <w:rPr>
-          <w:b/>
-          <w:bCs/>
-        </w:rPr>
-        <w:t xml:space="preserve"> &amp; Khairnar)</w:t>
-      </w:r>
-    </w:p>
-    <w:p>
-      <w:pPr>
-        <w:ind w:left="-900" w:right="-900"/>
-        <w:jc w:val="both"/>
-      </w:pPr>
-      <w:r>
-        <w:t xml:space="preserve">Reviews 10 algorithms across heuristics, DRL, neural forecasting, and multi-agent systems, finding hybrids consistently outperform single-method approaches. Its own limitation is that it compares algorithm </w:t>
-      </w:r>
-      <w:r>
-        <w:rPr>
-          <w:i/>
-          <w:iCs/>
-        </w:rPr>
-        <w:t>*types*</w:t>
-      </w:r>
-      <w:r>
-        <w:t xml:space="preserve"> rather than head-to-head measured performance under standardized conditions, so practitioners can't easily judge which approach to actually implement. The deeper gap is the field's lack of shared benchmarks — without standardized environments and metrics, even this well-organized comparative review can only offer qualitative guidance, not a clear "best choice."</w:t>
-      </w:r>
-    </w:p>
-    <w:p>
-      <w:pPr>
-        <w:ind w:left="-900" w:right="-900"/>
-        <w:jc w:val="both"/>
-      </w:pPr>
+        <w:t>Paper 5: Machine Learning-Based Cloud Resource Allocation Algorithms — Comparative Review (Bodra &amp; Khairnar)</w:t>
+      </w:r>
+    </w:p>
+    <w:p>
+      <w:pPr>
+        <w:ind w:left="-900" w:right="-900"/>
+        <w:jc w:val="both"/>
+      </w:pPr>
+      <w:r>
+        <w:t>Examines 10 algorithms in terms of their use of heuristics, DRL, neural forecast, and multi-agent systems and finds that combinations perform better than algorithms using a single method. However, its weakness is that it evaluates the algorithms based on their types instead of comparing their performance through standardized testing, thereby leaving readers unable to conclude which algorithm should be used. The more fundamental issue is that the field does not have any benchmarking methods.</w:t>
+      </w:r>
     </w:p>
     <w:p>
       <w:pPr>
@@ -830,12 +602,6 @@
         <w:gridCol w:w="1422"/>
       </w:tblGrid>
       <w:tr>
-        <w:tblPrEx>
-          <w:tblCellMar>
-            <w:top w:w="0" w:type="dxa"/>
-            <w:bottom w:w="0" w:type="dxa"/>
-          </w:tblCellMar>
-        </w:tblPrEx>
         <w:tc>
           <w:tcPr>
             <w:tcW w:w="528" w:type="pct"/>
@@ -929,12 +695,6 @@
         </w:tc>
       </w:tr>
       <w:tr>
-        <w:tblPrEx>
-          <w:tblCellMar>
-            <w:top w:w="0" w:type="dxa"/>
-            <w:bottom w:w="0" w:type="dxa"/>
-          </w:tblCellMar>
-        </w:tblPrEx>
         <w:tc>
           <w:tcPr>
             <w:tcW w:w="525" w:type="pct"/>
@@ -945,23 +705,7 @@
                 <w:sz w:val="18"/>
                 <w:szCs w:val="18"/>
               </w:rPr>
-              <w:t xml:space="preserve">1. Green DB </w:t>
-            </w:r>
-            <w:proofErr w:type="spellStart"/>
-            <w:r>
-              <w:rPr>
-                <w:sz w:val="18"/>
-                <w:szCs w:val="18"/>
-              </w:rPr>
-              <w:t>Mgmt</w:t>
-            </w:r>
-            <w:proofErr w:type="spellEnd"/>
-            <w:r>
-              <w:rPr>
-                <w:sz w:val="18"/>
-                <w:szCs w:val="18"/>
-              </w:rPr>
-              <w:t xml:space="preserve"> AI (Oloruntoba)</w:t>
+              <w:t>1. Green DB Mgmt AI (Oloruntoba)</w:t>
             </w:r>
           </w:p>
         </w:tc>
@@ -1037,12 +781,6 @@
         </w:tc>
       </w:tr>
       <w:tr>
-        <w:tblPrEx>
-          <w:tblCellMar>
-            <w:top w:w="0" w:type="dxa"/>
-            <w:bottom w:w="0" w:type="dxa"/>
-          </w:tblCellMar>
-        </w:tblPrEx>
         <w:tc>
           <w:tcPr>
             <w:tcW w:w="525" w:type="pct"/>
@@ -1053,39 +791,7 @@
                 <w:sz w:val="18"/>
                 <w:szCs w:val="18"/>
               </w:rPr>
-              <w:t>2. Energy/Thermal ML Taxonomy (</w:t>
-            </w:r>
-            <w:proofErr w:type="spellStart"/>
-            <w:r>
-              <w:rPr>
-                <w:sz w:val="18"/>
-                <w:szCs w:val="18"/>
-              </w:rPr>
-              <w:t>Ilager</w:t>
-            </w:r>
-            <w:proofErr w:type="spellEnd"/>
-            <w:r>
-              <w:rPr>
-                <w:sz w:val="18"/>
-                <w:szCs w:val="18"/>
-              </w:rPr>
-              <w:t xml:space="preserve"> &amp; </w:t>
-            </w:r>
-            <w:proofErr w:type="spellStart"/>
-            <w:r>
-              <w:rPr>
-                <w:sz w:val="18"/>
-                <w:szCs w:val="18"/>
-              </w:rPr>
-              <w:t>Buyya</w:t>
-            </w:r>
-            <w:proofErr w:type="spellEnd"/>
-            <w:r>
-              <w:rPr>
-                <w:sz w:val="18"/>
-                <w:szCs w:val="18"/>
-              </w:rPr>
-              <w:t>)</w:t>
+              <w:t>2. Energy/Thermal ML Taxonomy (Ilager &amp; Buyya)</w:t>
             </w:r>
           </w:p>
         </w:tc>
@@ -1161,12 +867,6 @@
         </w:tc>
       </w:tr>
       <w:tr>
-        <w:tblPrEx>
-          <w:tblCellMar>
-            <w:top w:w="0" w:type="dxa"/>
-            <w:bottom w:w="0" w:type="dxa"/>
-          </w:tblCellMar>
-        </w:tblPrEx>
         <w:tc>
           <w:tcPr>
             <w:tcW w:w="525" w:type="pct"/>
@@ -1191,17 +891,8 @@
                 <w:sz w:val="18"/>
                 <w:szCs w:val="18"/>
               </w:rPr>
-              <w:t xml:space="preserve">Weighted A3C DRL, priority-weighted </w:t>
-            </w:r>
-            <w:proofErr w:type="spellStart"/>
-            <w:r>
-              <w:rPr>
-                <w:sz w:val="18"/>
-                <w:szCs w:val="18"/>
-              </w:rPr>
-              <w:t>softmax</w:t>
-            </w:r>
-            <w:proofErr w:type="spellEnd"/>
+              <w:t>Weighted A3C DRL, priority-weighted softmax</w:t>
+            </w:r>
           </w:p>
         </w:tc>
         <w:tc>
@@ -1262,12 +953,6 @@
         </w:tc>
       </w:tr>
       <w:tr>
-        <w:tblPrEx>
-          <w:tblCellMar>
-            <w:top w:w="0" w:type="dxa"/>
-            <w:bottom w:w="0" w:type="dxa"/>
-          </w:tblCellMar>
-        </w:tblPrEx>
         <w:tc>
           <w:tcPr>
             <w:tcW w:w="525" w:type="pct"/>
@@ -1354,12 +1039,6 @@
         </w:tc>
       </w:tr>
       <w:tr>
-        <w:tblPrEx>
-          <w:tblCellMar>
-            <w:top w:w="0" w:type="dxa"/>
-            <w:bottom w:w="0" w:type="dxa"/>
-          </w:tblCellMar>
-        </w:tblPrEx>
         <w:tc>
           <w:tcPr>
             <w:tcW w:w="525" w:type="pct"/>
@@ -1370,23 +1049,7 @@
                 <w:sz w:val="18"/>
                 <w:szCs w:val="18"/>
               </w:rPr>
-              <w:t xml:space="preserve">5. </w:t>
-            </w:r>
-            <w:proofErr w:type="spellStart"/>
-            <w:r>
-              <w:rPr>
-                <w:sz w:val="18"/>
-                <w:szCs w:val="18"/>
-              </w:rPr>
-              <w:t>HunterPlus</w:t>
-            </w:r>
-            <w:proofErr w:type="spellEnd"/>
-            <w:r>
-              <w:rPr>
-                <w:sz w:val="18"/>
-                <w:szCs w:val="18"/>
-              </w:rPr>
-              <w:t xml:space="preserve"> Cloud-Fog Sched. (Iftikhar et al.)</w:t>
+              <w:t>5. HunterPlus Cloud-Fog Sched. (Iftikhar et al.)</w:t>
             </w:r>
           </w:p>
         </w:tc>
@@ -1462,12 +1125,6 @@
         </w:tc>
       </w:tr>
       <w:tr>
-        <w:tblPrEx>
-          <w:tblCellMar>
-            <w:top w:w="0" w:type="dxa"/>
-            <w:bottom w:w="0" w:type="dxa"/>
-          </w:tblCellMar>
-        </w:tblPrEx>
         <w:tc>
           <w:tcPr>
             <w:tcW w:w="525" w:type="pct"/>
@@ -1478,39 +1135,14 @@
                 <w:sz w:val="18"/>
                 <w:szCs w:val="18"/>
               </w:rPr>
-              <w:t xml:space="preserve">1. AI Smart Campus Energy </w:t>
-            </w:r>
-            <w:proofErr w:type="spellStart"/>
-            <w:r>
-              <w:rPr>
-                <w:sz w:val="18"/>
-                <w:szCs w:val="18"/>
-              </w:rPr>
-              <w:t>Mgmt</w:t>
-            </w:r>
-            <w:proofErr w:type="spellEnd"/>
-            <w:r>
-              <w:rPr>
-                <w:sz w:val="18"/>
-                <w:szCs w:val="18"/>
-              </w:rPr>
-              <w:t xml:space="preserve"> (</w:t>
-            </w:r>
-            <w:proofErr w:type="spellStart"/>
-            <w:r>
-              <w:rPr>
-                <w:sz w:val="18"/>
-                <w:szCs w:val="18"/>
-              </w:rPr>
-              <w:t>Manassra</w:t>
-            </w:r>
-            <w:proofErr w:type="spellEnd"/>
-            <w:r>
-              <w:rPr>
-                <w:sz w:val="18"/>
-                <w:szCs w:val="18"/>
-              </w:rPr>
-              <w:t xml:space="preserve"> &amp; Işık)</w:t>
+              <w:t>6</w:t>
+            </w:r>
+            <w:r>
+              <w:rPr>
+                <w:sz w:val="18"/>
+                <w:szCs w:val="18"/>
+              </w:rPr>
+              <w:t>. AI Smart Campus Energy Mgmt (Manassra &amp; Işık)</w:t>
             </w:r>
           </w:p>
         </w:tc>
@@ -1586,12 +1218,6 @@
         </w:tc>
       </w:tr>
       <w:tr>
-        <w:tblPrEx>
-          <w:tblCellMar>
-            <w:top w:w="0" w:type="dxa"/>
-            <w:bottom w:w="0" w:type="dxa"/>
-          </w:tblCellMar>
-        </w:tblPrEx>
         <w:tc>
           <w:tcPr>
             <w:tcW w:w="525" w:type="pct"/>
@@ -1602,7 +1228,14 @@
                 <w:sz w:val="18"/>
                 <w:szCs w:val="18"/>
               </w:rPr>
-              <w:t>2. Carbon-Aware Task Scheduling (Beena et al.)</w:t>
+              <w:t>7</w:t>
+            </w:r>
+            <w:r>
+              <w:rPr>
+                <w:sz w:val="18"/>
+                <w:szCs w:val="18"/>
+              </w:rPr>
+              <w:t>. Carbon-Aware Task Scheduling (Beena et al.)</w:t>
             </w:r>
           </w:p>
         </w:tc>
@@ -1678,12 +1311,6 @@
         </w:tc>
       </w:tr>
       <w:tr>
-        <w:tblPrEx>
-          <w:tblCellMar>
-            <w:top w:w="0" w:type="dxa"/>
-            <w:bottom w:w="0" w:type="dxa"/>
-          </w:tblCellMar>
-        </w:tblPrEx>
         <w:tc>
           <w:tcPr>
             <w:tcW w:w="525" w:type="pct"/>
@@ -1694,7 +1321,14 @@
                 <w:sz w:val="18"/>
                 <w:szCs w:val="18"/>
               </w:rPr>
-              <w:t>3. AI for Cloud Networking (Mohammed et al.)</w:t>
+              <w:t>8</w:t>
+            </w:r>
+            <w:r>
+              <w:rPr>
+                <w:sz w:val="18"/>
+                <w:szCs w:val="18"/>
+              </w:rPr>
+              <w:t>. AI for Cloud Networking (Mohammed et al.)</w:t>
             </w:r>
           </w:p>
         </w:tc>
@@ -1770,12 +1404,6 @@
         </w:tc>
       </w:tr>
       <w:tr>
-        <w:tblPrEx>
-          <w:tblCellMar>
-            <w:top w:w="0" w:type="dxa"/>
-            <w:bottom w:w="0" w:type="dxa"/>
-          </w:tblCellMar>
-        </w:tblPrEx>
         <w:tc>
           <w:tcPr>
             <w:tcW w:w="525" w:type="pct"/>
@@ -1786,7 +1414,14 @@
                 <w:sz w:val="18"/>
                 <w:szCs w:val="18"/>
               </w:rPr>
-              <w:t>4. CFWS DRL Framework (Zhao, Zhou &amp; Li)</w:t>
+              <w:t>9</w:t>
+            </w:r>
+            <w:r>
+              <w:rPr>
+                <w:sz w:val="18"/>
+                <w:szCs w:val="18"/>
+              </w:rPr>
+              <w:t>. CFWS DRL Framework (Zhao, Zhou &amp; Li)</w:t>
             </w:r>
           </w:p>
         </w:tc>
@@ -1814,23 +1449,7 @@
                 <w:sz w:val="18"/>
                 <w:szCs w:val="18"/>
               </w:rPr>
-              <w:t xml:space="preserve">Simulation vs. </w:t>
-            </w:r>
-            <w:proofErr w:type="spellStart"/>
-            <w:r>
-              <w:rPr>
-                <w:sz w:val="18"/>
-                <w:szCs w:val="18"/>
-              </w:rPr>
-              <w:t>Greenpacker</w:t>
-            </w:r>
-            <w:proofErr w:type="spellEnd"/>
-            <w:r>
-              <w:rPr>
-                <w:sz w:val="18"/>
-                <w:szCs w:val="18"/>
-              </w:rPr>
-              <w:t>/LECC/ADVMC</w:t>
+              <w:t>Simulation vs. Greenpacker/LECC/ADVMC</w:t>
             </w:r>
           </w:p>
         </w:tc>
@@ -1878,12 +1497,6 @@
         </w:tc>
       </w:tr>
       <w:tr>
-        <w:tblPrEx>
-          <w:tblCellMar>
-            <w:top w:w="0" w:type="dxa"/>
-            <w:bottom w:w="0" w:type="dxa"/>
-          </w:tblCellMar>
-        </w:tblPrEx>
         <w:tc>
           <w:tcPr>
             <w:tcW w:w="525" w:type="pct"/>
@@ -1894,7 +1507,14 @@
                 <w:sz w:val="18"/>
                 <w:szCs w:val="18"/>
               </w:rPr>
-              <w:t xml:space="preserve">5. Smart Campus Tech </w:t>
+              <w:t>10</w:t>
+            </w:r>
+            <w:r>
+              <w:rPr>
+                <w:sz w:val="18"/>
+                <w:szCs w:val="18"/>
+              </w:rPr>
+              <w:t xml:space="preserve">. Smart Campus Tech </w:t>
             </w:r>
             <w:r>
               <w:rPr>
@@ -1945,17 +1565,8 @@
                 <w:sz w:val="18"/>
                 <w:szCs w:val="18"/>
               </w:rPr>
-              <w:t xml:space="preserve">40-70% HVAC savings; ~64% with </w:t>
-            </w:r>
-            <w:proofErr w:type="spellStart"/>
-            <w:r>
-              <w:rPr>
-                <w:sz w:val="18"/>
-                <w:szCs w:val="18"/>
-              </w:rPr>
-              <w:t>IoT+solar</w:t>
-            </w:r>
-            <w:proofErr w:type="spellEnd"/>
+              <w:t>40-70% HVAC savings; ~64% with IoT+solar</w:t>
+            </w:r>
           </w:p>
         </w:tc>
         <w:tc>
@@ -1996,12 +1607,6 @@
         </w:tc>
       </w:tr>
       <w:tr>
-        <w:tblPrEx>
-          <w:tblCellMar>
-            <w:top w:w="0" w:type="dxa"/>
-            <w:bottom w:w="0" w:type="dxa"/>
-          </w:tblCellMar>
-        </w:tblPrEx>
         <w:tc>
           <w:tcPr>
             <w:tcW w:w="525" w:type="pct"/>
@@ -2013,23 +1618,14 @@
                 <w:szCs w:val="18"/>
               </w:rPr>
               <w:lastRenderedPageBreak/>
-              <w:t xml:space="preserve">6. Power Supply-Side </w:t>
-            </w:r>
-            <w:proofErr w:type="spellStart"/>
-            <w:r>
-              <w:rPr>
-                <w:sz w:val="18"/>
-                <w:szCs w:val="18"/>
-              </w:rPr>
-              <w:t>Mgmt</w:t>
-            </w:r>
-            <w:proofErr w:type="spellEnd"/>
-            <w:r>
-              <w:rPr>
-                <w:sz w:val="18"/>
-                <w:szCs w:val="18"/>
-              </w:rPr>
-              <w:t xml:space="preserve"> (Huang, Lin, Lin &amp; Li)</w:t>
+              <w:t>11</w:t>
+            </w:r>
+            <w:r>
+              <w:rPr>
+                <w:sz w:val="18"/>
+                <w:szCs w:val="18"/>
+              </w:rPr>
+              <w:t>. Power Supply-Side Mgmt (Huang, Lin, Lin &amp; Li)</w:t>
             </w:r>
           </w:p>
         </w:tc>
@@ -2105,12 +1701,6 @@
         </w:tc>
       </w:tr>
       <w:tr>
-        <w:tblPrEx>
-          <w:tblCellMar>
-            <w:top w:w="0" w:type="dxa"/>
-            <w:bottom w:w="0" w:type="dxa"/>
-          </w:tblCellMar>
-        </w:tblPrEx>
         <w:tc>
           <w:tcPr>
             <w:tcW w:w="525" w:type="pct"/>
@@ -2121,7 +1711,21 @@
                 <w:sz w:val="18"/>
                 <w:szCs w:val="18"/>
               </w:rPr>
-              <w:t>1. Cloud RA via ML (Wang &amp; Yang)</w:t>
+              <w:t>1</w:t>
+            </w:r>
+            <w:r>
+              <w:rPr>
+                <w:sz w:val="18"/>
+                <w:szCs w:val="18"/>
+              </w:rPr>
+              <w:t>2</w:t>
+            </w:r>
+            <w:r>
+              <w:rPr>
+                <w:sz w:val="18"/>
+                <w:szCs w:val="18"/>
+              </w:rPr>
+              <w:t>. Cloud RA via ML (Wang &amp; Yang)</w:t>
             </w:r>
           </w:p>
         </w:tc>
@@ -2197,12 +1801,6 @@
         </w:tc>
       </w:tr>
       <w:tr>
-        <w:tblPrEx>
-          <w:tblCellMar>
-            <w:top w:w="0" w:type="dxa"/>
-            <w:bottom w:w="0" w:type="dxa"/>
-          </w:tblCellMar>
-        </w:tblPrEx>
         <w:tc>
           <w:tcPr>
             <w:tcW w:w="525" w:type="pct"/>
@@ -2213,7 +1811,14 @@
                 <w:sz w:val="18"/>
                 <w:szCs w:val="18"/>
               </w:rPr>
-              <w:t>2. FL Energy-Efficiency Survey (Yan et al.)</w:t>
+              <w:t>13</w:t>
+            </w:r>
+            <w:r>
+              <w:rPr>
+                <w:sz w:val="18"/>
+                <w:szCs w:val="18"/>
+              </w:rPr>
+              <w:t>. FL Energy-Efficiency Survey (Yan et al.)</w:t>
             </w:r>
           </w:p>
         </w:tc>
@@ -2289,12 +1894,6 @@
         </w:tc>
       </w:tr>
       <w:tr>
-        <w:tblPrEx>
-          <w:tblCellMar>
-            <w:top w:w="0" w:type="dxa"/>
-            <w:bottom w:w="0" w:type="dxa"/>
-          </w:tblCellMar>
-        </w:tblPrEx>
         <w:tc>
           <w:tcPr>
             <w:tcW w:w="525" w:type="pct"/>
@@ -2305,39 +1904,14 @@
                 <w:sz w:val="18"/>
                 <w:szCs w:val="18"/>
               </w:rPr>
-              <w:t>3. RL-Based VM Placement / RLVMP (</w:t>
-            </w:r>
-            <w:proofErr w:type="spellStart"/>
-            <w:r>
-              <w:rPr>
-                <w:sz w:val="18"/>
-                <w:szCs w:val="18"/>
-              </w:rPr>
-              <w:t>Amahrouch</w:t>
-            </w:r>
-            <w:proofErr w:type="spellEnd"/>
-            <w:r>
-              <w:rPr>
-                <w:sz w:val="18"/>
-                <w:szCs w:val="18"/>
-              </w:rPr>
-              <w:t xml:space="preserve">, Saadi &amp; El </w:t>
-            </w:r>
-            <w:proofErr w:type="spellStart"/>
-            <w:r>
-              <w:rPr>
-                <w:sz w:val="18"/>
-                <w:szCs w:val="18"/>
-              </w:rPr>
-              <w:t>Kafhali</w:t>
-            </w:r>
-            <w:proofErr w:type="spellEnd"/>
-            <w:r>
-              <w:rPr>
-                <w:sz w:val="18"/>
-                <w:szCs w:val="18"/>
-              </w:rPr>
-              <w:t>)</w:t>
+              <w:t>14</w:t>
+            </w:r>
+            <w:r>
+              <w:rPr>
+                <w:sz w:val="18"/>
+                <w:szCs w:val="18"/>
+              </w:rPr>
+              <w:t>. RL-Based VM Placement / RLVMP (Amahrouch, Saadi &amp; El Kafhali)</w:t>
             </w:r>
           </w:p>
         </w:tc>
@@ -2365,17 +1939,8 @@
                 <w:sz w:val="18"/>
                 <w:szCs w:val="18"/>
               </w:rPr>
-              <w:t xml:space="preserve">Azure traces via </w:t>
-            </w:r>
-            <w:proofErr w:type="spellStart"/>
-            <w:r>
-              <w:rPr>
-                <w:sz w:val="18"/>
-                <w:szCs w:val="18"/>
-              </w:rPr>
-              <w:t>CloudSim</w:t>
-            </w:r>
-            <w:proofErr w:type="spellEnd"/>
+              <w:t>Azure traces via CloudSim</w:t>
+            </w:r>
           </w:p>
         </w:tc>
         <w:tc>
@@ -2422,12 +1987,6 @@
         </w:tc>
       </w:tr>
       <w:tr>
-        <w:tblPrEx>
-          <w:tblCellMar>
-            <w:top w:w="0" w:type="dxa"/>
-            <w:bottom w:w="0" w:type="dxa"/>
-          </w:tblCellMar>
-        </w:tblPrEx>
         <w:tc>
           <w:tcPr>
             <w:tcW w:w="525" w:type="pct"/>
@@ -2438,7 +1997,14 @@
                 <w:sz w:val="18"/>
                 <w:szCs w:val="18"/>
               </w:rPr>
-              <w:t>4. FL Server Workload Allocation (Safari &amp; Rahimi)</w:t>
+              <w:t>15</w:t>
+            </w:r>
+            <w:r>
+              <w:rPr>
+                <w:sz w:val="18"/>
+                <w:szCs w:val="18"/>
+              </w:rPr>
+              <w:t>. FL Server Workload Allocation (Safari &amp; Rahimi)</w:t>
             </w:r>
           </w:p>
         </w:tc>
@@ -2514,12 +2080,6 @@
         </w:tc>
       </w:tr>
       <w:tr>
-        <w:tblPrEx>
-          <w:tblCellMar>
-            <w:top w:w="0" w:type="dxa"/>
-            <w:bottom w:w="0" w:type="dxa"/>
-          </w:tblCellMar>
-        </w:tblPrEx>
         <w:tc>
           <w:tcPr>
             <w:tcW w:w="525" w:type="pct"/>
@@ -2530,23 +2090,14 @@
                 <w:sz w:val="18"/>
                 <w:szCs w:val="18"/>
               </w:rPr>
-              <w:t>5. Cloud RA — Comparative Review (</w:t>
-            </w:r>
-            <w:proofErr w:type="spellStart"/>
-            <w:r>
-              <w:rPr>
-                <w:sz w:val="18"/>
-                <w:szCs w:val="18"/>
-              </w:rPr>
-              <w:t>Bodra</w:t>
-            </w:r>
-            <w:proofErr w:type="spellEnd"/>
-            <w:r>
-              <w:rPr>
-                <w:sz w:val="18"/>
-                <w:szCs w:val="18"/>
-              </w:rPr>
-              <w:t xml:space="preserve"> &amp; Khairnar)</w:t>
+              <w:t>16</w:t>
+            </w:r>
+            <w:r>
+              <w:rPr>
+                <w:sz w:val="18"/>
+                <w:szCs w:val="18"/>
+              </w:rPr>
+              <w:t>. Cloud RA — Comparative Review (Bodra &amp; Khairnar)</w:t>
             </w:r>
           </w:p>
         </w:tc>
@@ -2597,21 +2148,12 @@
             <w:tcW w:w="664" w:type="pct"/>
           </w:tcPr>
           <w:p>
-            <w:proofErr w:type="spellStart"/>
-            <w:r>
-              <w:rPr>
-                <w:sz w:val="18"/>
-                <w:szCs w:val="18"/>
-              </w:rPr>
-              <w:t>Deployability</w:t>
-            </w:r>
-            <w:proofErr w:type="spellEnd"/>
-            <w:r>
-              <w:rPr>
-                <w:sz w:val="18"/>
-                <w:szCs w:val="18"/>
-              </w:rPr>
-              <w:t xml:space="preserve"> vs. sophistication trade-off</w:t>
+            <w:r>
+              <w:rPr>
+                <w:sz w:val="18"/>
+                <w:szCs w:val="18"/>
+              </w:rPr>
+              <w:t>Deployability vs. sophistication trade-off</w:t>
             </w:r>
           </w:p>
         </w:tc>

</xml_diff>